<commit_message>
TS 5.2 Kramam Tamil
</commit_message>
<xml_diff>
--- a/TS-Kramam/TS-5.3/TS 5.3 Tamil Krama Paatam Corrections.docx
+++ b/TS-Kramam/TS-5.3/TS 5.3 Tamil Krama Paatam Corrections.docx
@@ -81,7 +81,18 @@
           <w:szCs w:val="32"/>
           <w:u w:val="single"/>
         </w:rPr>
-        <w:t xml:space="preserve">Observed till </w:t>
+        <w:t xml:space="preserve">Observed </w:t>
+      </w:r>
+      <w:proofErr w:type="gramStart"/>
+      <w:r>
+        <w:rPr>
+          <w:b/>
+          <w:bCs/>
+          <w:sz w:val="32"/>
+          <w:szCs w:val="32"/>
+          <w:u w:val="single"/>
+        </w:rPr>
+        <w:t xml:space="preserve">till </w:t>
       </w:r>
       <w:r>
         <w:rPr>
@@ -94,6 +105,7 @@
         </w:rPr>
         <w:t>???</w:t>
       </w:r>
+      <w:proofErr w:type="gramEnd"/>
     </w:p>
     <w:p>
       <w:pPr>
@@ -114,7 +126,7 @@
     </w:p>
     <w:tbl>
       <w:tblPr>
-        <w:tblW w:w="14679" w:type="dxa"/>
+        <w:tblW w:w="14395" w:type="dxa"/>
         <w:tblInd w:w="-792" w:type="dxa"/>
         <w:tblBorders>
           <w:top w:val="single" w:sz="4" w:space="0" w:color="000000"/>
@@ -130,7 +142,6 @@
         <w:gridCol w:w="3764"/>
         <w:gridCol w:w="5528"/>
         <w:gridCol w:w="5103"/>
-        <w:gridCol w:w="284"/>
       </w:tblGrid>
       <w:tr>
         <w:tc>
@@ -142,12 +153,16 @@
               <w:spacing w:before="0" w:line="240" w:lineRule="auto"/>
               <w:jc w:val="center"/>
               <w:rPr>
+                <w:b/>
+                <w:bCs/>
                 <w:sz w:val="32"/>
                 <w:szCs w:val="32"/>
               </w:rPr>
             </w:pPr>
             <w:r>
               <w:rPr>
+                <w:b/>
+                <w:bCs/>
                 <w:sz w:val="32"/>
                 <w:szCs w:val="32"/>
               </w:rPr>
@@ -159,12 +174,16 @@
               <w:spacing w:before="0" w:line="240" w:lineRule="auto"/>
               <w:jc w:val="center"/>
               <w:rPr>
+                <w:b/>
+                <w:bCs/>
                 <w:sz w:val="32"/>
                 <w:szCs w:val="32"/>
               </w:rPr>
             </w:pPr>
             <w:r>
               <w:rPr>
+                <w:b/>
+                <w:bCs/>
                 <w:sz w:val="32"/>
                 <w:szCs w:val="32"/>
               </w:rPr>
@@ -181,12 +200,16 @@
               <w:spacing w:before="0" w:line="240" w:lineRule="auto"/>
               <w:jc w:val="center"/>
               <w:rPr>
+                <w:b/>
+                <w:bCs/>
                 <w:sz w:val="32"/>
                 <w:szCs w:val="32"/>
               </w:rPr>
             </w:pPr>
             <w:r>
               <w:rPr>
+                <w:b/>
+                <w:bCs/>
                 <w:sz w:val="32"/>
                 <w:szCs w:val="32"/>
               </w:rPr>
@@ -196,8 +219,7 @@
         </w:tc>
         <w:tc>
           <w:tcPr>
-            <w:tcW w:w="5387" w:type="dxa"/>
-            <w:gridSpan w:val="2"/>
+            <w:tcW w:w="5103" w:type="dxa"/>
           </w:tcPr>
           <w:p>
             <w:pPr>
@@ -205,12 +227,16 @@
               <w:ind w:right="-18"/>
               <w:jc w:val="center"/>
               <w:rPr>
+                <w:b/>
+                <w:bCs/>
                 <w:sz w:val="32"/>
                 <w:szCs w:val="32"/>
               </w:rPr>
             </w:pPr>
             <w:r>
               <w:rPr>
+                <w:b/>
+                <w:bCs/>
                 <w:sz w:val="32"/>
                 <w:szCs w:val="32"/>
               </w:rPr>
@@ -755,8 +781,7 @@
         </w:tc>
         <w:tc>
           <w:tcPr>
-            <w:tcW w:w="5387" w:type="dxa"/>
-            <w:gridSpan w:val="2"/>
+            <w:tcW w:w="5103" w:type="dxa"/>
           </w:tcPr>
           <w:p>
             <w:pPr>
@@ -1675,8 +1700,7 @@
         </w:tc>
         <w:tc>
           <w:tcPr>
-            <w:tcW w:w="5387" w:type="dxa"/>
-            <w:gridSpan w:val="2"/>
+            <w:tcW w:w="5103" w:type="dxa"/>
           </w:tcPr>
           <w:p>
             <w:pPr>
@@ -2605,8 +2629,7 @@
         </w:tc>
         <w:tc>
           <w:tcPr>
-            <w:tcW w:w="5387" w:type="dxa"/>
-            <w:gridSpan w:val="2"/>
+            <w:tcW w:w="5103" w:type="dxa"/>
           </w:tcPr>
           <w:p>
             <w:pPr>
@@ -3367,8 +3390,7 @@
         </w:tc>
         <w:tc>
           <w:tcPr>
-            <w:tcW w:w="5387" w:type="dxa"/>
-            <w:gridSpan w:val="2"/>
+            <w:tcW w:w="5103" w:type="dxa"/>
           </w:tcPr>
           <w:p>
             <w:pPr>
@@ -3574,8 +3596,6 @@
       </w:tr>
       <w:tr>
         <w:trPr>
-          <w:gridAfter w:val="1"/>
-          <w:wAfter w:w="284" w:type="dxa"/>
           <w:trHeight w:val="1550"/>
         </w:trPr>
         <w:tc>
@@ -4181,8 +4201,7 @@
         </w:tc>
         <w:tc>
           <w:tcPr>
-            <w:tcW w:w="5387" w:type="dxa"/>
-            <w:gridSpan w:val="2"/>
+            <w:tcW w:w="5103" w:type="dxa"/>
           </w:tcPr>
           <w:p>
             <w:pPr>
@@ -12497,7 +12516,16 @@
           <w:bCs/>
           <w:sz w:val="32"/>
         </w:rPr>
-        <w:t>replaced with</w:t>
+        <w:t xml:space="preserve">replaced </w:t>
+      </w:r>
+      <w:proofErr w:type="gramStart"/>
+      <w:r>
+        <w:rPr>
+          <w:b/>
+          <w:bCs/>
+          <w:sz w:val="32"/>
+        </w:rPr>
+        <w:t>with</w:t>
       </w:r>
       <w:r>
         <w:rPr>
@@ -12519,6 +12547,7 @@
         </w:rPr>
         <w:t>"</w:t>
       </w:r>
+      <w:proofErr w:type="gramEnd"/>
       <w:r>
         <w:rPr>
           <w:rFonts w:ascii="Latha" w:hAnsi="Latha" w:cs="Latha"/>

</xml_diff>